<commit_message>
features: Mudança do front-end para corporativo
</commit_message>
<xml_diff>
--- a/docs/ArquiKota-Documentacao.docx
+++ b/docs/ArquiKota-Documentacao.docx
@@ -2,56 +2,6 @@
 <file path=word/document.xml><?xml version="1.0" encoding="utf-8"?>
 <w:document xmlns:w="http://schemas.openxmlformats.org/wordprocessingml/2006/main" xmlns:m="http://schemas.openxmlformats.org/officeDocument/2006/math" xmlns:r="http://schemas.openxmlformats.org/officeDocument/2006/relationships" xmlns:o="urn:schemas-microsoft-com:office:office" xmlns:v="urn:schemas-microsoft-com:vml" xmlns:w10="urn:schemas-microsoft-com:office:word" xmlns:a="http://schemas.openxmlformats.org/drawingml/2006/main" xmlns:pic="http://schemas.openxmlformats.org/drawingml/2006/picture" xmlns:wp="http://schemas.openxmlformats.org/drawingml/2006/wordprocessingDrawing">
   <w:body>
-    <w:p>
-      <w:pPr>
-        <w:pStyle w:val="Title"/>
-      </w:pPr>
-      <w:r>
-        <w:t xml:space="preserve">ArquiKota — Documentação do projeto</w:t>
-      </w:r>
-    </w:p>
-    <w:p>
-      <w:pPr>
-        <w:pStyle w:val="Author"/>
-      </w:pPr>
-      <w:r>
-        <w:t xml:space="preserve">ArquiKota</w:t>
-      </w:r>
-    </w:p>
-    <w:p>
-      <w:pPr>
-        <w:pStyle w:val="Date"/>
-      </w:pPr>
-      <w:r>
-        <w:t xml:space="preserve">Outubro 2026</w:t>
-      </w:r>
-    </w:p>
-    <w:sdt>
-      <w:sdtPr>
-        <w:docPartObj>
-          <w:docPartGallery w:val="Table of Contents"/>
-          <w:docPartUnique/>
-        </w:docPartObj>
-      </w:sdtPr>
-      <w:sdtContent>
-        <w:p>
-          <w:pPr>
-            <w:pStyle w:val="TOCHeading"/>
-          </w:pPr>
-          <w:r>
-            <w:t xml:space="preserve">Table of Contents</w:t>
-          </w:r>
-        </w:p>
-        <w:p>
-          <w:r>
-            <w:fldChar w:fldCharType="begin" w:dirty="true"/>
-            <w:instrText xml:space="preserve">TOC \o "1-2" \h \z \u</w:instrText>
-            <w:fldChar w:fldCharType="separate"/>
-            <w:fldChar w:fldCharType="end"/>
-          </w:r>
-        </w:p>
-      </w:sdtContent>
-    </w:sdt>
     <w:bookmarkStart w:id="40" w:name="arquikota-documentação-do-projeto"/>
     <w:p>
       <w:pPr>
@@ -70,7 +20,7 @@
           <w:b/>
           <w:bCs/>
         </w:rPr>
-        <w:t xml:space="preserve">Trabalho n.º 16 · ArquiKota · maintenance studio</w:t>
+        <w:t xml:space="preserve">Trabalho n.º 16 · ArquiKota · monitor de manutenção contínua</w:t>
       </w:r>
       <w:r>
         <w:t xml:space="preserve"> </w:t>
@@ -222,7 +172,7 @@
       <w:r>
         <w:drawing>
           <wp:inline>
-            <wp:extent cx="5334000" cy="8890000"/>
+            <wp:extent cx="5334000" cy="4445000"/>
             <wp:effectExtent b="0" l="0" r="0" t="0"/>
             <wp:docPr descr="Painel do ArquiKota com diagnóstico, alertas e índice de saúde" title="" id="10" name="Picture"/>
             <a:graphic>
@@ -243,7 +193,7 @@
                   <pic:spPr bwMode="auto">
                     <a:xfrm>
                       <a:off x="0" y="0"/>
-                      <a:ext cx="5334000" cy="8890000"/>
+                      <a:ext cx="5334000" cy="4445000"/>
                     </a:xfrm>
                     <a:prstGeom prst="rect">
                       <a:avLst/>
@@ -810,7 +760,7 @@
               <w:pStyle w:val="Compact"/>
             </w:pPr>
             <w:r>
-              <w:t xml:space="preserve">Painel responsivo com identidade “blueprint” escura.</w:t>
+              <w:t xml:space="preserve">Painel responsivo com identidade corporativa clara: azul-marinho, superfícies brancas e hierarquia tipográfica sóbria.</w:t>
             </w:r>
           </w:p>
         </w:tc>

</xml_diff>